<commit_message>
Refonte complète du CV en ligne et mise à jour du CV
- Nouveau site : thème néon animé, mission Agrica en bento, parcours
  filtrable, palette Ctrl+K ; CSS et JS dans des fichiers dédiés
- Portraits illustré et photo (bascule au clic), images optimisées
- Mission Agrica : monitoring des flux (Nuxt.js), refonte agrica.fr
  (Drupal headless + Next.js), échanges partenaires (Next.js + Keycloak),
  CI Maven / Jenkins / SonarQube
- Versions Drupal 7 à 11
- Nouveau CV PDF généré depuis cv-source/cv.html, CV Word mis à jour
- Suppression des assets du template inutilisés

Co-Authored-By: Claude Opus 5.5 <noreply@anthropic.com>
</commit_message>
<xml_diff>
--- a/CV-Jbenamar.docx
+++ b/CV-Jbenamar.docx
@@ -391,7 +391,7 @@
         <w:rPr>
           <w:rFonts w:ascii="Helvetica Light" w:hAnsi="Helvetica Light"/>
         </w:rPr>
-        <w:t>10</w:t>
+        <w:t>plus de 15</w:t>
       </w:r>
       <w:r>
         <w:rPr>
@@ -836,7 +836,7 @@
           <w:color w:val="000000" w:themeColor="text1"/>
           <w:kern w:val="24"/>
         </w:rPr>
-        <w:t>8</w:t>
+        <w:t>8 / 9 / 10 / 11</w:t>
       </w:r>
       <w:r>
         <w:rPr>
@@ -952,6 +952,69 @@
           <w:kern w:val="24"/>
         </w:rPr>
         <w:t>/ CSS</w:t>
+      </w:r>
+    </w:p>
+    <w:p>
+      <w:pPr>
+        <w:pStyle w:val="Paragraphedeliste"/>
+        <w:numPr>
+          <w:ilvl w:val="0"/>
+          <w:numId w:val="15"/>
+        </w:numPr>
+        <w:rPr>
+          <w:rFonts w:eastAsia="Times New Roman"/>
+          <w:color w:val="000000" w:themeColor="text1"/>
+        </w:rPr>
+      </w:pPr>
+      <w:r>
+        <w:rPr>
+          <w:rFonts w:ascii="Helvetica Light" w:eastAsia="Calibri" w:hAnsi="Helvetica Light"/>
+          <w:color w:val="000000" w:themeColor="text1"/>
+          <w:kern w:val="24"/>
+        </w:rPr>
+        <w:t xml:space="preserve">Next.js / Nuxt.js (React / Vue.js)</w:t>
+      </w:r>
+    </w:p>
+    <w:p>
+      <w:pPr>
+        <w:pStyle w:val="Paragraphedeliste"/>
+        <w:numPr>
+          <w:ilvl w:val="0"/>
+          <w:numId w:val="15"/>
+        </w:numPr>
+        <w:rPr>
+          <w:rFonts w:eastAsia="Times New Roman"/>
+          <w:color w:val="000000" w:themeColor="text1"/>
+        </w:rPr>
+      </w:pPr>
+      <w:r>
+        <w:rPr>
+          <w:rFonts w:ascii="Helvetica Light" w:eastAsia="Calibri" w:hAnsi="Helvetica Light"/>
+          <w:color w:val="000000" w:themeColor="text1"/>
+          <w:kern w:val="24"/>
+        </w:rPr>
+        <w:t xml:space="preserve">Drupal headless / Keycloak</w:t>
+      </w:r>
+    </w:p>
+    <w:p>
+      <w:pPr>
+        <w:pStyle w:val="Paragraphedeliste"/>
+        <w:numPr>
+          <w:ilvl w:val="0"/>
+          <w:numId w:val="15"/>
+        </w:numPr>
+        <w:rPr>
+          <w:rFonts w:eastAsia="Times New Roman"/>
+          <w:color w:val="000000" w:themeColor="text1"/>
+        </w:rPr>
+      </w:pPr>
+      <w:r>
+        <w:rPr>
+          <w:rFonts w:ascii="Helvetica Light" w:eastAsia="Calibri" w:hAnsi="Helvetica Light"/>
+          <w:color w:val="000000" w:themeColor="text1"/>
+          <w:kern w:val="24"/>
+        </w:rPr>
+        <w:t xml:space="preserve">Maven / Jenkins / SonarQube</w:t>
       </w:r>
     </w:p>
     <w:p>
@@ -1553,7 +1616,7 @@
           <w:rFonts w:ascii="Helvetica Light" w:hAnsi="Helvetica Light"/>
           <w:bCs/>
         </w:rPr>
-        <w:t xml:space="preserve">  Lead développeur</w:t>
+        <w:t xml:space="preserve">  Lead développeur / Lead technique Front</w:t>
       </w:r>
     </w:p>
     <w:p>
@@ -1684,6 +1747,91 @@
     </w:p>
     <w:p>
       <w:pPr>
+        <w:numPr>
+          <w:ilvl w:val="0"/>
+          <w:numId w:val="11"/>
+        </w:numPr>
+        <w:rPr>
+          <w:rFonts w:ascii="Helvetica Light" w:hAnsi="Helvetica Light"/>
+        </w:rPr>
+      </w:pPr>
+      <w:r>
+        <w:rPr>
+          <w:rFonts w:ascii="Helvetica Light" w:hAnsi="Helvetica Light"/>
+        </w:rPr>
+        <w:t xml:space="preserve">Application Nuxt.js de monitoring des flux et de gestion des rejeux de flux.</w:t>
+      </w:r>
+    </w:p>
+    <w:p>
+      <w:pPr>
+        <w:numPr>
+          <w:ilvl w:val="0"/>
+          <w:numId w:val="11"/>
+        </w:numPr>
+        <w:rPr>
+          <w:rFonts w:ascii="Helvetica Light" w:hAnsi="Helvetica Light"/>
+        </w:rPr>
+      </w:pPr>
+      <w:r>
+        <w:rPr>
+          <w:rFonts w:ascii="Helvetica Light" w:hAnsi="Helvetica Light"/>
+        </w:rPr>
+        <w:t xml:space="preserve">Refonte du site agrica.fr : Drupal en mode headless + front Next.js.</w:t>
+      </w:r>
+    </w:p>
+    <w:p>
+      <w:pPr>
+        <w:numPr>
+          <w:ilvl w:val="0"/>
+          <w:numId w:val="11"/>
+        </w:numPr>
+        <w:rPr>
+          <w:rFonts w:ascii="Helvetica Light" w:hAnsi="Helvetica Light"/>
+        </w:rPr>
+      </w:pPr>
+      <w:r>
+        <w:rPr>
+          <w:rFonts w:ascii="Helvetica Light" w:hAnsi="Helvetica Light"/>
+        </w:rPr>
+        <w:t xml:space="preserve">Application Next.js de gestion des échanges entre partenaires, avec authentification Keycloak.</w:t>
+      </w:r>
+    </w:p>
+    <w:p>
+      <w:pPr>
+        <w:numPr>
+          <w:ilvl w:val="0"/>
+          <w:numId w:val="11"/>
+        </w:numPr>
+        <w:rPr>
+          <w:rFonts w:ascii="Helvetica Light" w:hAnsi="Helvetica Light"/>
+        </w:rPr>
+      </w:pPr>
+      <w:r>
+        <w:rPr>
+          <w:rFonts w:ascii="Helvetica Light" w:hAnsi="Helvetica Light"/>
+        </w:rPr>
+        <w:t xml:space="preserve">Initialisation des configurations Maven, Jenkins et SonarQube des 3 nouveaux projets.</w:t>
+      </w:r>
+    </w:p>
+    <w:p>
+      <w:pPr>
+        <w:numPr>
+          <w:ilvl w:val="0"/>
+          <w:numId w:val="11"/>
+        </w:numPr>
+        <w:rPr>
+          <w:rFonts w:ascii="Helvetica Light" w:hAnsi="Helvetica Light"/>
+        </w:rPr>
+      </w:pPr>
+      <w:r>
+        <w:rPr>
+          <w:rFonts w:ascii="Helvetica Light" w:hAnsi="Helvetica Light"/>
+        </w:rPr>
+        <w:t xml:space="preserve">Encadrement technique de 7 développeurs front répartis sur 3 équipes.</w:t>
+      </w:r>
+    </w:p>
+    <w:p>
+      <w:pPr>
         <w:ind w:left="720"/>
         <w:rPr>
           <w:rFonts w:ascii="Helvetica Light" w:hAnsi="Helvetica Light"/>
@@ -1728,7 +1876,7 @@
         <w:rPr>
           <w:rFonts w:ascii="Helvetica Light" w:hAnsi="Helvetica Light"/>
         </w:rPr>
-        <w:t xml:space="preserve"> 8</w:t>
+        <w:t xml:space="preserve"> 8 à 11</w:t>
       </w:r>
       <w:r>
         <w:rPr>
@@ -1755,6 +1903,57 @@
           <w:rFonts w:ascii="Helvetica Light" w:hAnsi="Helvetica Light"/>
         </w:rPr>
         <w:t>jQuery / CSS</w:t>
+      </w:r>
+    </w:p>
+    <w:p>
+      <w:pPr>
+        <w:numPr>
+          <w:ilvl w:val="0"/>
+          <w:numId w:val="12"/>
+        </w:numPr>
+        <w:rPr>
+          <w:rFonts w:ascii="Helvetica Light" w:hAnsi="Helvetica Light"/>
+        </w:rPr>
+      </w:pPr>
+      <w:r>
+        <w:rPr>
+          <w:rFonts w:ascii="Helvetica Light" w:hAnsi="Helvetica Light"/>
+        </w:rPr>
+        <w:t xml:space="preserve">Nuxt.js / Vue.js / Next.js / React</w:t>
+      </w:r>
+    </w:p>
+    <w:p>
+      <w:pPr>
+        <w:numPr>
+          <w:ilvl w:val="0"/>
+          <w:numId w:val="12"/>
+        </w:numPr>
+        <w:rPr>
+          <w:rFonts w:ascii="Helvetica Light" w:hAnsi="Helvetica Light"/>
+        </w:rPr>
+      </w:pPr>
+      <w:r>
+        <w:rPr>
+          <w:rFonts w:ascii="Helvetica Light" w:hAnsi="Helvetica Light"/>
+        </w:rPr>
+        <w:t xml:space="preserve">Drupal headless / Keycloak</w:t>
+      </w:r>
+    </w:p>
+    <w:p>
+      <w:pPr>
+        <w:numPr>
+          <w:ilvl w:val="0"/>
+          <w:numId w:val="12"/>
+        </w:numPr>
+        <w:rPr>
+          <w:rFonts w:ascii="Helvetica Light" w:hAnsi="Helvetica Light"/>
+        </w:rPr>
+      </w:pPr>
+      <w:r>
+        <w:rPr>
+          <w:rFonts w:ascii="Helvetica Light" w:hAnsi="Helvetica Light"/>
+        </w:rPr>
+        <w:t xml:space="preserve">Maven / Jenkins / SonarQube</w:t>
       </w:r>
     </w:p>
     <w:p>

</xml_diff>